<commit_message>
gps section: layout round 2
</commit_message>
<xml_diff>
--- a/docs/gps-section.docx
+++ b/docs/gps-section.docx
@@ -2298,6 +2298,417 @@
         <w:t xml:space="preserve">• مقارنة بين ال GPS نظام تحديد المواقع العالمي و ال D-GPS نظام تحديد المواقع العالمي التفاضلي :</w:t>
       </w:r>
     </w:p>
+    <w:tbl>
+      <w:tblPr>
+        <w:tblStyle w:val="Table"/>
+        <w:tblW w:type="auto" w:w="0"/>
+        <w:tblLook w:firstRow="1" w:lastRow="0" w:firstColumn="0" w:lastColumn="0" w:noHBand="0" w:noVBand="0" w:val="0020"/>
+      </w:tblPr>
+      <w:tblGrid>
+        <w:gridCol w:w="2640"/>
+        <w:gridCol w:w="2640"/>
+        <w:gridCol w:w="2640"/>
+      </w:tblGrid>
+      <w:tr>
+        <w:trPr>
+          <w:tblHeader w:val="on"/>
+        </w:trPr>
+        <w:tc>
+          <w:tcPr/>
+          <w:p>
+            <w:pPr>
+              <w:pStyle w:val="Compact"/>
+            </w:pPr>
+            <w:r>
+              <w:rPr>
+                <w:lang w:val="ar"/>
+              </w:rPr>
+              <w:t xml:space="preserve">العنصر</w:t>
+            </w:r>
+          </w:p>
+        </w:tc>
+        <w:tc>
+          <w:tcPr/>
+          <w:p>
+            <w:pPr>
+              <w:pStyle w:val="Compact"/>
+            </w:pPr>
+            <w:r>
+              <w:rPr>
+                <w:lang w:val="ar"/>
+              </w:rPr>
+              <w:t xml:space="preserve">GPS (GLOBAL POSITIONING SYSTEM)</w:t>
+            </w:r>
+          </w:p>
+        </w:tc>
+        <w:tc>
+          <w:tcPr/>
+          <w:p>
+            <w:pPr>
+              <w:pStyle w:val="Compact"/>
+            </w:pPr>
+            <w:r>
+              <w:rPr>
+                <w:lang w:val="ar"/>
+              </w:rPr>
+              <w:t xml:space="preserve">DGPS (DIFFERENTIAL GLOBAL POSITIONING SYSTEM)</w:t>
+            </w:r>
+          </w:p>
+        </w:tc>
+      </w:tr>
+      <w:tr>
+        <w:tc>
+          <w:tcPr/>
+          <w:p>
+            <w:pPr>
+              <w:pStyle w:val="Compact"/>
+            </w:pPr>
+            <w:r>
+              <w:rPr>
+                <w:lang w:val="ar"/>
+              </w:rPr>
+              <w:t xml:space="preserve">التعريف</w:t>
+            </w:r>
+          </w:p>
+        </w:tc>
+        <w:tc>
+          <w:tcPr/>
+          <w:p>
+            <w:pPr>
+              <w:pStyle w:val="Compact"/>
+            </w:pPr>
+            <w:r>
+              <w:rPr>
+                <w:lang w:val="ar"/>
+              </w:rPr>
+              <w:t xml:space="preserve">نظام عالمي لتحديد المواقع يعتمد على أقمار صناعية تبث إشارات للمستقبلات.</w:t>
+            </w:r>
+          </w:p>
+        </w:tc>
+        <w:tc>
+          <w:tcPr/>
+          <w:p>
+            <w:pPr>
+              <w:pStyle w:val="Compact"/>
+            </w:pPr>
+            <w:r>
+              <w:rPr>
+                <w:lang w:val="ar"/>
+              </w:rPr>
+              <w:t xml:space="preserve">نظام يعتمد على إشارات GPS لكنه يضيف محطات أرضية مرجعية لتصحيح الأخطاء.</w:t>
+            </w:r>
+          </w:p>
+        </w:tc>
+      </w:tr>
+      <w:tr>
+        <w:tc>
+          <w:tcPr/>
+          <w:p>
+            <w:pPr>
+              <w:pStyle w:val="Compact"/>
+            </w:pPr>
+            <w:r>
+              <w:rPr>
+                <w:lang w:val="ar"/>
+              </w:rPr>
+              <w:t xml:space="preserve">المكونات</w:t>
+            </w:r>
+          </w:p>
+        </w:tc>
+        <w:tc>
+          <w:tcPr/>
+          <w:p>
+            <w:pPr>
+              <w:pStyle w:val="Compact"/>
+            </w:pPr>
+            <w:r>
+              <w:rPr>
+                <w:lang w:val="ar"/>
+              </w:rPr>
+              <w:t xml:space="preserve">أقمار صناعية + جهاز مستقبل</w:t>
+            </w:r>
+          </w:p>
+        </w:tc>
+        <w:tc>
+          <w:tcPr/>
+          <w:p>
+            <w:pPr>
+              <w:pStyle w:val="Compact"/>
+            </w:pPr>
+            <w:r>
+              <w:rPr>
+                <w:lang w:val="ar"/>
+              </w:rPr>
+              <w:t xml:space="preserve">أقمار صناعية + مستقبل + محطة أرضية</w:t>
+            </w:r>
+          </w:p>
+        </w:tc>
+      </w:tr>
+      <w:tr>
+        <w:tc>
+          <w:tcPr/>
+          <w:p>
+            <w:pPr>
+              <w:pStyle w:val="Compact"/>
+            </w:pPr>
+            <w:r>
+              <w:rPr>
+                <w:lang w:val="ar"/>
+              </w:rPr>
+              <w:t xml:space="preserve">التكلفة</w:t>
+            </w:r>
+          </w:p>
+        </w:tc>
+        <w:tc>
+          <w:tcPr/>
+          <w:p>
+            <w:pPr>
+              <w:pStyle w:val="Compact"/>
+            </w:pPr>
+            <w:r>
+              <w:rPr>
+                <w:lang w:val="ar"/>
+              </w:rPr>
+              <w:t xml:space="preserve">أجهزة GPS العادية أرخص ومتاحة للجميع.</w:t>
+            </w:r>
+          </w:p>
+        </w:tc>
+        <w:tc>
+          <w:tcPr/>
+          <w:p>
+            <w:pPr>
+              <w:pStyle w:val="Compact"/>
+            </w:pPr>
+            <w:r>
+              <w:rPr>
+                <w:lang w:val="ar"/>
+              </w:rPr>
+              <w:t xml:space="preserve">أجهزة DGPS أغلى وتحتاج إلى معدات إضافية وخدمات تصحيح.</w:t>
+            </w:r>
+          </w:p>
+        </w:tc>
+      </w:tr>
+      <w:tr>
+        <w:tc>
+          <w:tcPr/>
+          <w:p>
+            <w:pPr>
+              <w:pStyle w:val="Compact"/>
+            </w:pPr>
+            <w:r>
+              <w:rPr>
+                <w:lang w:val="ar"/>
+              </w:rPr>
+              <w:t xml:space="preserve">استخدام الإنترنت/إشارة إضافية</w:t>
+            </w:r>
+          </w:p>
+        </w:tc>
+        <w:tc>
+          <w:tcPr/>
+          <w:p>
+            <w:pPr>
+              <w:pStyle w:val="Compact"/>
+            </w:pPr>
+            <w:r>
+              <w:rPr>
+                <w:lang w:val="ar"/>
+              </w:rPr>
+              <w:t xml:space="preserve">لا يحتاج إلا إلى استقبال إشارة من الأقمار الصناعية.</w:t>
+            </w:r>
+          </w:p>
+        </w:tc>
+        <w:tc>
+          <w:tcPr/>
+          <w:p>
+            <w:pPr>
+              <w:pStyle w:val="Compact"/>
+            </w:pPr>
+            <w:r>
+              <w:rPr>
+                <w:lang w:val="ar"/>
+              </w:rPr>
+              <w:t xml:space="preserve">يحتاج إلى قناة اتصال إضافية لتلقي بيانات التصحيح (راديو، إنترنت، أو أقمار صناعية أرضية).</w:t>
+            </w:r>
+          </w:p>
+        </w:tc>
+      </w:tr>
+      <w:tr>
+        <w:tc>
+          <w:tcPr/>
+          <w:p>
+            <w:pPr>
+              <w:pStyle w:val="Compact"/>
+            </w:pPr>
+            <w:r>
+              <w:rPr>
+                <w:lang w:val="ar"/>
+              </w:rPr>
+              <w:t xml:space="preserve">الاستخدام</w:t>
+            </w:r>
+          </w:p>
+        </w:tc>
+        <w:tc>
+          <w:tcPr/>
+          <w:p>
+            <w:pPr>
+              <w:pStyle w:val="Compact"/>
+            </w:pPr>
+            <w:r>
+              <w:rPr>
+                <w:lang w:val="ar"/>
+              </w:rPr>
+              <w:t xml:space="preserve">الملاحة العامة والزوارق والهواتف والسيارات.</w:t>
+            </w:r>
+          </w:p>
+        </w:tc>
+        <w:tc>
+          <w:tcPr/>
+          <w:p>
+            <w:pPr>
+              <w:pStyle w:val="Compact"/>
+            </w:pPr>
+            <w:r>
+              <w:rPr>
+                <w:lang w:val="ar"/>
+              </w:rPr>
+              <w:t xml:space="preserve">مدني أيضاً: الموانئ والمنارات البحرية والمسح الهيدروغرافي وأعمال الحفر. (ليس عسكرياً، فالجيوش تستخدم إشارة مشفرة مختلفة تماماً).</w:t>
+            </w:r>
+          </w:p>
+        </w:tc>
+      </w:tr>
+      <w:tr>
+        <w:tc>
+          <w:tcPr/>
+          <w:p>
+            <w:pPr>
+              <w:pStyle w:val="Compact"/>
+            </w:pPr>
+            <w:r>
+              <w:rPr>
+                <w:lang w:val="ar"/>
+              </w:rPr>
+              <w:t xml:space="preserve">قياس السرعة والمسافة</w:t>
+            </w:r>
+          </w:p>
+        </w:tc>
+        <w:tc>
+          <w:tcPr/>
+          <w:p>
+            <w:pPr>
+              <w:pStyle w:val="Compact"/>
+            </w:pPr>
+            <w:r>
+              <w:rPr>
+                <w:lang w:val="ar"/>
+              </w:rPr>
+              <w:t xml:space="preserve">دقيق</w:t>
+            </w:r>
+          </w:p>
+        </w:tc>
+        <w:tc>
+          <w:tcPr/>
+          <w:p>
+            <w:pPr>
+              <w:pStyle w:val="Compact"/>
+            </w:pPr>
+            <w:r>
+              <w:rPr>
+                <w:lang w:val="ar"/>
+              </w:rPr>
+              <w:t xml:space="preserve">أكثر دقة فهو يصحح أي أخطاء في إشارات ال GPS العادي</w:t>
+            </w:r>
+          </w:p>
+        </w:tc>
+      </w:tr>
+      <w:tr>
+        <w:tc>
+          <w:tcPr/>
+          <w:p>
+            <w:pPr>
+              <w:pStyle w:val="Compact"/>
+            </w:pPr>
+            <w:r>
+              <w:rPr>
+                <w:lang w:val="ar"/>
+              </w:rPr>
+              <w:t xml:space="preserve">مدى الدقة</w:t>
+            </w:r>
+          </w:p>
+        </w:tc>
+        <w:tc>
+          <w:tcPr/>
+          <w:p>
+            <w:pPr>
+              <w:pStyle w:val="Compact"/>
+            </w:pPr>
+            <w:r>
+              <w:rPr>
+                <w:lang w:val="ar"/>
+              </w:rPr>
+              <w:t xml:space="preserve">حوالي 3 إلى 5 أمتار في الظروف العادية.</w:t>
+            </w:r>
+          </w:p>
+        </w:tc>
+        <w:tc>
+          <w:tcPr/>
+          <w:p>
+            <w:pPr>
+              <w:pStyle w:val="Compact"/>
+            </w:pPr>
+            <w:r>
+              <w:rPr>
+                <w:lang w:val="ar"/>
+              </w:rPr>
+              <w:t xml:space="preserve">حوالي 1 إلى 3 أمتار. (دقة السنتيمترات تقنية أخرى اسمها RTK تستخدم في المسح وليست DGPS).</w:t>
+            </w:r>
+          </w:p>
+        </w:tc>
+      </w:tr>
+      <w:tr>
+        <w:tc>
+          <w:tcPr/>
+          <w:p>
+            <w:pPr>
+              <w:pStyle w:val="Compact"/>
+            </w:pPr>
+            <w:r>
+              <w:rPr>
+                <w:lang w:val="ar"/>
+              </w:rPr>
+              <w:t xml:space="preserve">طريقة العمل</w:t>
+            </w:r>
+          </w:p>
+        </w:tc>
+        <w:tc>
+          <w:tcPr/>
+          <w:p>
+            <w:pPr>
+              <w:pStyle w:val="Compact"/>
+            </w:pPr>
+            <w:r>
+              <w:rPr>
+                <w:lang w:val="ar"/>
+              </w:rPr>
+              <w:t xml:space="preserve">ترسل الإشارة مباشرة لأجهزة الاستقبال الموجودة في أجهزتنا مثل (الهاتف والساعة الذكية والخ ...) من الأقمار الصناعية.</w:t>
+            </w:r>
+          </w:p>
+        </w:tc>
+        <w:tc>
+          <w:tcPr/>
+          <w:p>
+            <w:pPr>
+              <w:pStyle w:val="Compact"/>
+            </w:pPr>
+            <w:r>
+              <w:rPr>
+                <w:lang w:val="ar"/>
+              </w:rPr>
+              <w:t xml:space="preserve">ترسل الإشارة في نفس الوقت من الأقمار الصناعية لأجهزة الاستقبال و المحطات الأرضية فتقوم المحطات الأرضية بتصحيح الأخطاء الممكنة بسبب خلل في ساعات الأقمار الصناعية أو للتأثر بحالات الطقس وإعادة ارسالها لأجهزة تحديد المواقع العالمي التفاضلي ال DGPS</w:t>
+            </w:r>
+          </w:p>
+        </w:tc>
+      </w:tr>
+    </w:tbl>
     <w:p>
       <w:pPr>
         <w:pStyle w:val="Figure"/>
@@ -2345,420 +2756,9 @@
         </w:drawing>
       </w:r>
     </w:p>
-    <w:tbl>
-      <w:tblPr>
-        <w:tblStyle w:val="Table"/>
-        <w:tblW w:type="auto" w:w="0"/>
-        <w:tblLook w:firstRow="1" w:lastRow="0" w:firstColumn="0" w:lastColumn="0" w:noHBand="0" w:noVBand="0" w:val="0020"/>
-      </w:tblPr>
-      <w:tblGrid>
-        <w:gridCol w:w="2640"/>
-        <w:gridCol w:w="2640"/>
-        <w:gridCol w:w="2640"/>
-      </w:tblGrid>
-      <w:tr>
-        <w:trPr>
-          <w:tblHeader w:val="on"/>
-        </w:trPr>
-        <w:tc>
-          <w:tcPr/>
-          <w:p>
-            <w:pPr>
-              <w:pStyle w:val="Compact"/>
-            </w:pPr>
-            <w:r>
-              <w:rPr>
-                <w:lang w:val="ar"/>
-              </w:rPr>
-              <w:t xml:space="preserve">العنصر</w:t>
-            </w:r>
-          </w:p>
-        </w:tc>
-        <w:tc>
-          <w:tcPr/>
-          <w:p>
-            <w:pPr>
-              <w:pStyle w:val="Compact"/>
-            </w:pPr>
-            <w:r>
-              <w:rPr>
-                <w:lang w:val="ar"/>
-              </w:rPr>
-              <w:t xml:space="preserve">GPS (GLOBAL POSITIONING SYSTEM)</w:t>
-            </w:r>
-          </w:p>
-        </w:tc>
-        <w:tc>
-          <w:tcPr/>
-          <w:p>
-            <w:pPr>
-              <w:pStyle w:val="Compact"/>
-            </w:pPr>
-            <w:r>
-              <w:rPr>
-                <w:lang w:val="ar"/>
-              </w:rPr>
-              <w:t xml:space="preserve">DGPS (DIFFERENTIAL GLOBAL POSITIONING SYSTEM)</w:t>
-            </w:r>
-          </w:p>
-        </w:tc>
-      </w:tr>
-      <w:tr>
-        <w:tc>
-          <w:tcPr/>
-          <w:p>
-            <w:pPr>
-              <w:pStyle w:val="Compact"/>
-            </w:pPr>
-            <w:r>
-              <w:rPr>
-                <w:lang w:val="ar"/>
-              </w:rPr>
-              <w:t xml:space="preserve">التعريف</w:t>
-            </w:r>
-          </w:p>
-        </w:tc>
-        <w:tc>
-          <w:tcPr/>
-          <w:p>
-            <w:pPr>
-              <w:pStyle w:val="Compact"/>
-            </w:pPr>
-            <w:r>
-              <w:rPr>
-                <w:lang w:val="ar"/>
-              </w:rPr>
-              <w:t xml:space="preserve">نظام عالمي لتحديد المواقع يعتمد على أقمار صناعية تبث إشارات للمستقبلات.</w:t>
-            </w:r>
-          </w:p>
-        </w:tc>
-        <w:tc>
-          <w:tcPr/>
-          <w:p>
-            <w:pPr>
-              <w:pStyle w:val="Compact"/>
-            </w:pPr>
-            <w:r>
-              <w:rPr>
-                <w:lang w:val="ar"/>
-              </w:rPr>
-              <w:t xml:space="preserve">نظام يعتمد على إشارات GPS لكنه يضيف محطات أرضية مرجعية لتصحيح الأخطاء.</w:t>
-            </w:r>
-          </w:p>
-        </w:tc>
-      </w:tr>
-      <w:tr>
-        <w:tc>
-          <w:tcPr/>
-          <w:p>
-            <w:pPr>
-              <w:pStyle w:val="Compact"/>
-            </w:pPr>
-            <w:r>
-              <w:rPr>
-                <w:lang w:val="ar"/>
-              </w:rPr>
-              <w:t xml:space="preserve">المكونات</w:t>
-            </w:r>
-          </w:p>
-        </w:tc>
-        <w:tc>
-          <w:tcPr/>
-          <w:p>
-            <w:pPr>
-              <w:pStyle w:val="Compact"/>
-            </w:pPr>
-            <w:r>
-              <w:rPr>
-                <w:lang w:val="ar"/>
-              </w:rPr>
-              <w:t xml:space="preserve">أقمار صناعية + جهاز مستقبل</w:t>
-            </w:r>
-          </w:p>
-        </w:tc>
-        <w:tc>
-          <w:tcPr/>
-          <w:p>
-            <w:pPr>
-              <w:pStyle w:val="Compact"/>
-            </w:pPr>
-            <w:r>
-              <w:rPr>
-                <w:lang w:val="ar"/>
-              </w:rPr>
-              <w:t xml:space="preserve">أقمار صناعية + مستقبل + محطة أرضية</w:t>
-            </w:r>
-          </w:p>
-        </w:tc>
-      </w:tr>
-      <w:tr>
-        <w:tc>
-          <w:tcPr/>
-          <w:p>
-            <w:pPr>
-              <w:pStyle w:val="Compact"/>
-            </w:pPr>
-            <w:r>
-              <w:rPr>
-                <w:lang w:val="ar"/>
-              </w:rPr>
-              <w:t xml:space="preserve">التكلفة</w:t>
-            </w:r>
-          </w:p>
-        </w:tc>
-        <w:tc>
-          <w:tcPr/>
-          <w:p>
-            <w:pPr>
-              <w:pStyle w:val="Compact"/>
-            </w:pPr>
-            <w:r>
-              <w:rPr>
-                <w:lang w:val="ar"/>
-              </w:rPr>
-              <w:t xml:space="preserve">أجهزة GPS العادية أرخص ومتاحة للجميع.</w:t>
-            </w:r>
-          </w:p>
-        </w:tc>
-        <w:tc>
-          <w:tcPr/>
-          <w:p>
-            <w:pPr>
-              <w:pStyle w:val="Compact"/>
-            </w:pPr>
-            <w:r>
-              <w:rPr>
-                <w:lang w:val="ar"/>
-              </w:rPr>
-              <w:t xml:space="preserve">أجهزة DGPS أغلى وتحتاج إلى معدات إضافية وخدمات تصحيح.</w:t>
-            </w:r>
-          </w:p>
-        </w:tc>
-      </w:tr>
-      <w:tr>
-        <w:tc>
-          <w:tcPr/>
-          <w:p>
-            <w:pPr>
-              <w:pStyle w:val="Compact"/>
-            </w:pPr>
-            <w:r>
-              <w:rPr>
-                <w:lang w:val="ar"/>
-              </w:rPr>
-              <w:t xml:space="preserve">استخدام الإنترنت/إشارة إضافية</w:t>
-            </w:r>
-          </w:p>
-        </w:tc>
-        <w:tc>
-          <w:tcPr/>
-          <w:p>
-            <w:pPr>
-              <w:pStyle w:val="Compact"/>
-            </w:pPr>
-            <w:r>
-              <w:rPr>
-                <w:lang w:val="ar"/>
-              </w:rPr>
-              <w:t xml:space="preserve">لا يحتاج إلا إلى استقبال إشارة من الأقمار الصناعية.</w:t>
-            </w:r>
-          </w:p>
-        </w:tc>
-        <w:tc>
-          <w:tcPr/>
-          <w:p>
-            <w:pPr>
-              <w:pStyle w:val="Compact"/>
-            </w:pPr>
-            <w:r>
-              <w:rPr>
-                <w:lang w:val="ar"/>
-              </w:rPr>
-              <w:t xml:space="preserve">يحتاج إلى قناة اتصال إضافية لتلقي بيانات التصحيح (راديو، إنترنت، أو أقمار صناعية أرضية).</w:t>
-            </w:r>
-          </w:p>
-        </w:tc>
-      </w:tr>
-      <w:tr>
-        <w:tc>
-          <w:tcPr/>
-          <w:p>
-            <w:pPr>
-              <w:pStyle w:val="Compact"/>
-            </w:pPr>
-            <w:r>
-              <w:rPr>
-                <w:lang w:val="ar"/>
-              </w:rPr>
-              <w:t xml:space="preserve">الاستخدام</w:t>
-            </w:r>
-          </w:p>
-        </w:tc>
-        <w:tc>
-          <w:tcPr/>
-          <w:p>
-            <w:pPr>
-              <w:pStyle w:val="Compact"/>
-            </w:pPr>
-            <w:r>
-              <w:rPr>
-                <w:lang w:val="ar"/>
-              </w:rPr>
-              <w:t xml:space="preserve">الملاحة العامة والزوارق والهواتف والسيارات.</w:t>
-            </w:r>
-          </w:p>
-        </w:tc>
-        <w:tc>
-          <w:tcPr/>
-          <w:p>
-            <w:pPr>
-              <w:pStyle w:val="Compact"/>
-            </w:pPr>
-            <w:r>
-              <w:rPr>
-                <w:lang w:val="ar"/>
-              </w:rPr>
-              <w:t xml:space="preserve">مدني أيضاً: الموانئ والمنارات البحرية والمسح الهيدروغرافي وأعمال الحفر. (ليس عسكرياً، فالجيوش تستخدم إشارة مشفرة مختلفة تماماً).</w:t>
-            </w:r>
-          </w:p>
-        </w:tc>
-      </w:tr>
-      <w:tr>
-        <w:tc>
-          <w:tcPr/>
-          <w:p>
-            <w:pPr>
-              <w:pStyle w:val="Compact"/>
-            </w:pPr>
-            <w:r>
-              <w:rPr>
-                <w:lang w:val="ar"/>
-              </w:rPr>
-              <w:t xml:space="preserve">قياس السرعة والمسافة</w:t>
-            </w:r>
-          </w:p>
-        </w:tc>
-        <w:tc>
-          <w:tcPr/>
-          <w:p>
-            <w:pPr>
-              <w:pStyle w:val="Compact"/>
-            </w:pPr>
-            <w:r>
-              <w:rPr>
-                <w:lang w:val="ar"/>
-              </w:rPr>
-              <w:t xml:space="preserve">دقيق</w:t>
-            </w:r>
-          </w:p>
-        </w:tc>
-        <w:tc>
-          <w:tcPr/>
-          <w:p>
-            <w:pPr>
-              <w:pStyle w:val="Compact"/>
-            </w:pPr>
-            <w:r>
-              <w:rPr>
-                <w:lang w:val="ar"/>
-              </w:rPr>
-              <w:t xml:space="preserve">أكثر دقة فهو يصحح أي أخطاء في إشارات ال GPS العادي</w:t>
-            </w:r>
-          </w:p>
-        </w:tc>
-      </w:tr>
-      <w:tr>
-        <w:tc>
-          <w:tcPr/>
-          <w:p>
-            <w:pPr>
-              <w:pStyle w:val="Compact"/>
-            </w:pPr>
-            <w:r>
-              <w:rPr>
-                <w:lang w:val="ar"/>
-              </w:rPr>
-              <w:t xml:space="preserve">مدى الدقة</w:t>
-            </w:r>
-          </w:p>
-        </w:tc>
-        <w:tc>
-          <w:tcPr/>
-          <w:p>
-            <w:pPr>
-              <w:pStyle w:val="Compact"/>
-            </w:pPr>
-            <w:r>
-              <w:rPr>
-                <w:lang w:val="ar"/>
-              </w:rPr>
-              <w:t xml:space="preserve">حوالي 3 إلى 5 أمتار في الظروف العادية.</w:t>
-            </w:r>
-          </w:p>
-        </w:tc>
-        <w:tc>
-          <w:tcPr/>
-          <w:p>
-            <w:pPr>
-              <w:pStyle w:val="Compact"/>
-            </w:pPr>
-            <w:r>
-              <w:rPr>
-                <w:lang w:val="ar"/>
-              </w:rPr>
-              <w:t xml:space="preserve">حوالي 1 إلى 3 أمتار. (دقة السنتيمترات تقنية أخرى اسمها RTK تستخدم في المسح وليست DGPS).</w:t>
-            </w:r>
-          </w:p>
-        </w:tc>
-      </w:tr>
-      <w:tr>
-        <w:tc>
-          <w:tcPr/>
-          <w:p>
-            <w:pPr>
-              <w:pStyle w:val="Compact"/>
-            </w:pPr>
-            <w:r>
-              <w:rPr>
-                <w:lang w:val="ar"/>
-              </w:rPr>
-              <w:t xml:space="preserve">طريقة العمل</w:t>
-            </w:r>
-          </w:p>
-        </w:tc>
-        <w:tc>
-          <w:tcPr/>
-          <w:p>
-            <w:pPr>
-              <w:pStyle w:val="Compact"/>
-            </w:pPr>
-            <w:r>
-              <w:rPr>
-                <w:lang w:val="ar"/>
-              </w:rPr>
-              <w:t xml:space="preserve">ترسل الإشارة مباشرة لأجهزة الاستقبال الموجودة في أجهزتنا مثل (الهاتف والساعة الذكية والخ ...) من الأقمار الصناعية.</w:t>
-            </w:r>
-          </w:p>
-        </w:tc>
-        <w:tc>
-          <w:tcPr/>
-          <w:p>
-            <w:pPr>
-              <w:pStyle w:val="Compact"/>
-            </w:pPr>
-            <w:r>
-              <w:rPr>
-                <w:lang w:val="ar"/>
-              </w:rPr>
-              <w:t xml:space="preserve">ترسل الإشارة في نفس الوقت من الأقمار الصناعية لأجهزة الاستقبال و المحطات الأرضية فتقوم المحطات الأرضية بتصحيح الأخطاء الممكنة بسبب خلل في ساعات الأقمار الصناعية أو للتأثر بحالات الطقس وإعادة ارسالها لأجهزة تحديد المواقع العالمي التفاضلي ال DGPS</w:t>
-            </w:r>
-          </w:p>
-        </w:tc>
-      </w:tr>
-    </w:tbl>
-    <w:p>
-      <w:pPr>
-        <w:pStyle w:val="BodyText"/>
+    <w:p>
+      <w:pPr>
+        <w:pStyle w:val="FirstParagraph"/>
       </w:pPr>
       <w:r>
         <w:rPr>

</xml_diff>

<commit_message>
gps section round 3 (24 pages)
</commit_message>
<xml_diff>
--- a/docs/gps-section.docx
+++ b/docs/gps-section.docx
@@ -2865,56 +2865,128 @@
         <w:t xml:space="preserve">وهي شاشة الكريستال السائل وهي الشاشة العادية مثل شاشات التلفزيون والكمبيوتر .</w:t>
       </w:r>
     </w:p>
-    <w:p>
-      <w:pPr>
-        <w:pStyle w:val="Figure"/>
-      </w:pPr>
-      <w:r>
-        <w:drawing>
-          <wp:inline>
-            <wp:extent cx="5334000" cy="3668606"/>
-            <wp:effectExtent b="0" l="0" r="0" t="0"/>
-            <wp:docPr descr="" title="" id="35" name="Picture"/>
-            <a:graphic>
-              <a:graphicData uri="http://schemas.openxmlformats.org/drawingml/2006/picture">
-                <pic:pic>
-                  <pic:nvPicPr>
-                    <pic:cNvPr descr="img/g23_0.jpg" id="36" name="Picture"/>
-                    <pic:cNvPicPr>
-                      <a:picLocks noChangeArrowheads="1" noChangeAspect="1"/>
-                    </pic:cNvPicPr>
-                  </pic:nvPicPr>
-                  <pic:blipFill>
-                    <a:blip r:embed="rId28"/>
-                    <a:stretch>
-                      <a:fillRect/>
-                    </a:stretch>
-                  </pic:blipFill>
-                  <pic:spPr bwMode="auto">
-                    <a:xfrm>
-                      <a:off x="0" y="0"/>
-                      <a:ext cx="5334000" cy="3668606"/>
-                    </a:xfrm>
-                    <a:prstGeom prst="rect">
-                      <a:avLst/>
-                    </a:prstGeom>
-                    <a:noFill/>
-                    <a:ln w="9525">
-                      <a:noFill/>
-                      <a:headEnd/>
-                      <a:tailEnd/>
-                    </a:ln>
-                  </pic:spPr>
-                </pic:pic>
-              </a:graphicData>
-            </a:graphic>
-          </wp:inline>
-        </w:drawing>
-      </w:r>
-    </w:p>
-    <w:p>
-      <w:pPr>
-        <w:pStyle w:val="FirstParagraph"/>
+    <w:tbl>
+      <w:tblPr>
+        <w:tblStyle w:val="FigureTable"/>
+        <w:tblW w:type="auto" w:w="0"/>
+        <w:jc w:val="center"/>
+        <w:tblLook w:firstRow="0" w:lastRow="0" w:firstColumn="0" w:lastColumn="0"/>
+      </w:tblPr>
+      <w:tblGrid>
+        <w:gridCol w:w="7920"/>
+      </w:tblGrid>
+      <w:tr>
+        <w:tc>
+          <w:tcPr/>
+          <w:p>
+            <w:pPr>
+              <w:pStyle w:val="Compact"/>
+              <w:jc w:val="center"/>
+            </w:pPr>
+            <w:r>
+              <w:drawing>
+                <wp:inline>
+                  <wp:extent cx="5334000" cy="3668606"/>
+                  <wp:effectExtent b="0" l="0" r="0" t="0"/>
+                  <wp:docPr descr="" title="" id="35" name="Picture"/>
+                  <a:graphic>
+                    <a:graphicData uri="http://schemas.openxmlformats.org/drawingml/2006/picture">
+                      <pic:pic>
+                        <pic:nvPicPr>
+                          <pic:cNvPr descr="img/g23_0.jpg" id="36" name="Picture"/>
+                          <pic:cNvPicPr>
+                            <a:picLocks noChangeArrowheads="1" noChangeAspect="1"/>
+                          </pic:cNvPicPr>
+                        </pic:nvPicPr>
+                        <pic:blipFill>
+                          <a:blip r:embed="rId28"/>
+                          <a:stretch>
+                            <a:fillRect/>
+                          </a:stretch>
+                        </pic:blipFill>
+                        <pic:spPr bwMode="auto">
+                          <a:xfrm>
+                            <a:off x="0" y="0"/>
+                            <a:ext cx="5334000" cy="3668606"/>
+                          </a:xfrm>
+                          <a:prstGeom prst="rect">
+                            <a:avLst/>
+                          </a:prstGeom>
+                          <a:noFill/>
+                          <a:ln w="9525">
+                            <a:noFill/>
+                            <a:headEnd/>
+                            <a:tailEnd/>
+                          </a:ln>
+                        </pic:spPr>
+                      </pic:pic>
+                    </a:graphicData>
+                  </a:graphic>
+                </wp:inline>
+              </w:drawing>
+            </w:r>
+            <w:r>
+              <w:drawing>
+                <wp:inline>
+                  <wp:extent cx="5334000" cy="3758045"/>
+                  <wp:effectExtent b="0" l="0" r="0" t="0"/>
+                  <wp:docPr descr="" title="" id="38" name="Picture"/>
+                  <a:graphic>
+                    <a:graphicData uri="http://schemas.openxmlformats.org/drawingml/2006/picture">
+                      <pic:pic>
+                        <pic:nvPicPr>
+                          <pic:cNvPr descr="img/ribs-chart2.jpg" id="39" name="Picture"/>
+                          <pic:cNvPicPr>
+                            <a:picLocks noChangeArrowheads="1" noChangeAspect="1"/>
+                          </pic:cNvPicPr>
+                        </pic:nvPicPr>
+                        <pic:blipFill>
+                          <a:blip r:embed="rId37"/>
+                          <a:stretch>
+                            <a:fillRect/>
+                          </a:stretch>
+                        </pic:blipFill>
+                        <pic:spPr bwMode="auto">
+                          <a:xfrm>
+                            <a:off x="0" y="0"/>
+                            <a:ext cx="5334000" cy="3758045"/>
+                          </a:xfrm>
+                          <a:prstGeom prst="rect">
+                            <a:avLst/>
+                          </a:prstGeom>
+                          <a:noFill/>
+                          <a:ln w="9525">
+                            <a:noFill/>
+                            <a:headEnd/>
+                            <a:tailEnd/>
+                          </a:ln>
+                        </pic:spPr>
+                      </pic:pic>
+                    </a:graphicData>
+                  </a:graphic>
+                </wp:inline>
+              </w:drawing>
+            </w:r>
+          </w:p>
+        </w:tc>
+      </w:tr>
+    </w:tbl>
+    <w:p>
+      <w:pPr>
+        <w:pStyle w:val="BodyText"/>
+      </w:pPr>
+      <w:r>
+        <w:rPr>
+          <w:i/>
+          <w:iCs/>
+          <w:lang w:val="ar"/>
+        </w:rPr>
+        <w:t xml:space="preserve">جهاز GPS مستقل بشاشة LCD — وشاشة 3 in 1 في إحدى دورياتنا تعرض الخريطة مع بيانات الموقع</w:t>
+      </w:r>
+    </w:p>
+    <w:p>
+      <w:pPr>
+        <w:pStyle w:val="BodyText"/>
       </w:pPr>
       <w:r>
         <w:rPr>
@@ -2950,54 +3022,7 @@
     </w:p>
     <w:p>
       <w:pPr>
-        <w:pStyle w:val="Figure"/>
-      </w:pPr>
-      <w:r>
-        <w:drawing>
-          <wp:inline>
-            <wp:extent cx="5334000" cy="2094756"/>
-            <wp:effectExtent b="0" l="0" r="0" t="0"/>
-            <wp:docPr descr="" title="" id="38" name="Picture"/>
-            <a:graphic>
-              <a:graphicData uri="http://schemas.openxmlformats.org/drawingml/2006/picture">
-                <pic:pic>
-                  <pic:nvPicPr>
-                    <pic:cNvPr descr="img/g23_1.jpg" id="39" name="Picture"/>
-                    <pic:cNvPicPr>
-                      <a:picLocks noChangeArrowheads="1" noChangeAspect="1"/>
-                    </pic:cNvPicPr>
-                  </pic:nvPicPr>
-                  <pic:blipFill>
-                    <a:blip r:embed="rId37"/>
-                    <a:stretch>
-                      <a:fillRect/>
-                    </a:stretch>
-                  </pic:blipFill>
-                  <pic:spPr bwMode="auto">
-                    <a:xfrm>
-                      <a:off x="0" y="0"/>
-                      <a:ext cx="5334000" cy="2094756"/>
-                    </a:xfrm>
-                    <a:prstGeom prst="rect">
-                      <a:avLst/>
-                    </a:prstGeom>
-                    <a:noFill/>
-                    <a:ln w="9525">
-                      <a:noFill/>
-                      <a:headEnd/>
-                      <a:tailEnd/>
-                    </a:ln>
-                  </pic:spPr>
-                </pic:pic>
-              </a:graphicData>
-            </a:graphic>
-          </wp:inline>
-        </w:drawing>
-      </w:r>
-    </w:p>
-    <w:p>
-      <w:pPr>
-        <w:pStyle w:val="FirstParagraph"/>
+        <w:pStyle w:val="BodyText"/>
       </w:pPr>
       <w:r>
         <w:rPr>
@@ -3737,7 +3762,7 @@
                 <w:iCs/>
                 <w:lang w:val="ar"/>
               </w:rPr>
-              <w:t xml:space="preserve">هوائيا GPS خارجيان على سطح إحدى دوريات السبعميات — سماء مكشوفة بلا عوائق</w:t>
+              <w:t xml:space="preserve">هوائيا GPS خارجيان على سطح إحدى دوريات 700 Series — سماء مكشوفة بلا عوائق</w:t>
             </w:r>
           </w:p>
         </w:tc>
@@ -5977,7 +6002,7 @@
                     <a:graphicData uri="http://schemas.openxmlformats.org/drawingml/2006/picture">
                       <pic:pic>
                         <pic:nvPicPr>
-                          <pic:cNvPr descr="img/ribs-chart2.jpg" id="69" name="Picture"/>
+                          <pic:cNvPr descr="img/ribs-3in1-depth.jpg" id="69" name="Picture"/>
                           <pic:cNvPicPr>
                             <a:picLocks noChangeArrowheads="1" noChangeAspect="1"/>
                           </pic:cNvPicPr>
@@ -6024,7 +6049,7 @@
                 <w:iCs/>
                 <w:lang w:val="ar"/>
               </w:rPr>
-              <w:t xml:space="preserve">الجهاز جاهز للإبحار: الموقع على الخريطة يطابق الرصيف، والعمق والسرعة والاتجاه تعمل (دورية Ribs)</w:t>
+              <w:t xml:space="preserve">الجهاز جاهز للإبحار: الشاشة تعرض العمق والسونار بلا رسائل خطأ (دورية Ribs)</w:t>
             </w:r>
           </w:p>
         </w:tc>

</xml_diff>